<commit_message>
Update docs to plain, first-person framing with corrected accuracy scope, amortized cost notes, and honest latency reporting
</commit_message>
<xml_diff>
--- a/docs/Lyzr_TrackA_ScopingMemo.docx
+++ b/docs/Lyzr_TrackA_ScopingMemo.docx
@@ -4,279 +4,199 @@
   <w:body>
     <w:p>
       <w:pPr>
-        <w:spacing w:after="40"/>
+        <w:spacing w:after="220"/>
         <w:jc w:val="center"/>
       </w:pPr>
       <w:r>
         <w:rPr>
           <w:b/>
           <w:bCs/>
-          <w:color w:val="1F4E79"/>
-          <w:sz w:val="30"/>
-          <w:szCs w:val="30"/>
-        </w:rPr>
-        <w:t xml:space="preserve">Client Scoping Note: Auto-Remediation from Logs</w:t>
-      </w:r>
-    </w:p>
-    <w:p>
-      <w:pPr>
-        <w:spacing w:after="200"/>
-        <w:jc w:val="center"/>
-      </w:pPr>
-      <w:r>
-        <w:rPr>
-          <w:i/>
-          <w:iCs/>
-          <w:color w:val="555555"/>
-          <w:sz w:val="17"/>
-          <w:szCs w:val="17"/>
-        </w:rPr>
-        <w:t xml:space="preserve">Prepared for: VP, Platform Engineering   |   From: Manoj Kumar, Forward Deployed Engineer, Lyzr   |   Re: Funding a log-noise-to-remediation agent</w:t>
+          <w:color w:val="000000"/>
+          <w:sz w:val="28"/>
+          <w:szCs w:val="28"/>
+        </w:rPr>
+        <w:t xml:space="preserve">Client Scoping Note</w:t>
       </w:r>
     </w:p>
     <w:p>
       <w:pPr>
         <w:pStyle w:val="Heading2"/>
-        <w:spacing w:after="60" w:before="160"/>
+        <w:spacing w:after="60" w:before="150"/>
       </w:pPr>
       <w:r>
         <w:rPr>
           <w:b/>
           <w:bCs/>
-          <w:color w:val="1F4E79"/>
-          <w:sz w:val="22"/>
-          <w:szCs w:val="22"/>
+          <w:color w:val="000000"/>
+          <w:sz w:val="21"/>
+          <w:szCs w:val="21"/>
         </w:rPr>
         <w:t xml:space="preserve">The problem</w:t>
       </w:r>
     </w:p>
     <w:p>
       <w:pPr>
-        <w:spacing w:after="100"/>
-      </w:pPr>
-      <w:r>
-        <w:rPr>
-          <w:sz w:val="19"/>
-          <w:szCs w:val="19"/>
-        </w:rPr>
-        <w:t xml:space="preserve">Your on-call and platform teams are buried in log and alert noise. On a typical day, roughly 95 out of every 100 log lines are repeats of the same handful of messages — health checks, cache warmups, debug flags — and only a small number are events that actually need a human to do something about them. Today someone has to read through all of it, or worse, alert fatigue means real incidents get missed in the noise. This agent reads the stream, throws away what's not actionable, figures out what kind of problem each real incident is, and proposes a fix from a pre-approved playbook — with a paper trail showing why it made that call.</w:t>
+        <w:spacing w:after="90"/>
+      </w:pPr>
+      <w:r>
+        <w:rPr>
+          <w:sz w:val="18"/>
+          <w:szCs w:val="18"/>
+        </w:rPr>
+        <w:t xml:space="preserve">Your on-call and platform teams are buried in log noise. Looking at a real sample of a similar size, about 44 percent of log lines are pure noise, health checks, cache warmups, debug flags, and most of the remaining lines are repeats of a small number of real incident patterns rather than unique events. Only a small number are things that actually need a person to act on. Right now someone has to sift through all of it, or worse, the noise causes real problems to get missed. This agent reads the stream, throws out what does not matter, works out what kind of problem each real issue is, and suggests a fix from an approved list, with a clear trail showing why it made that call.</w:t>
       </w:r>
     </w:p>
     <w:p>
       <w:pPr>
         <w:pStyle w:val="Heading2"/>
-        <w:spacing w:after="60" w:before="160"/>
+        <w:spacing w:after="60" w:before="150"/>
       </w:pPr>
       <w:r>
         <w:rPr>
           <w:b/>
           <w:bCs/>
-          <w:color w:val="1F4E79"/>
-          <w:sz w:val="22"/>
-          <w:szCs w:val="22"/>
-        </w:rPr>
-        <w:t xml:space="preserve">What "production-ready" means here</w:t>
-      </w:r>
-    </w:p>
-    <w:p>
-      <w:pPr>
-        <w:spacing w:after="100"/>
-      </w:pPr>
-      <w:r>
-        <w:rPr>
-          <w:sz w:val="19"/>
-          <w:szCs w:val="19"/>
-        </w:rPr>
-        <w:t xml:space="preserve">A demo that gets one example right in a chat window is not the same as a system that survives your actual log volume. Three things break first in a naive build: </w:t>
-      </w:r>
+          <w:color w:val="000000"/>
+          <w:sz w:val="21"/>
+          <w:szCs w:val="21"/>
+        </w:rPr>
+        <w:t xml:space="preserve">What actually working in production means here</w:t>
+      </w:r>
+    </w:p>
+    <w:p>
+      <w:pPr>
+        <w:spacing w:after="90"/>
+      </w:pPr>
+      <w:r>
+        <w:rPr>
+          <w:sz w:val="18"/>
+          <w:szCs w:val="18"/>
+        </w:rPr>
+        <w:t xml:space="preserve">A demo that gets one example right in a chat window is not the same as a system that can handle real log volume. Three things break first in a quick and dirty version. Cost, since calling a big model on every single line, including the large share that is noise, gets expensive fast and does not hold up on a busy day. Trust, since a model that is free to make up its own fix will eventually suggest something nobody signed off on, which is a real risk during an incident. And silent misses, since a system that guesses instead of admitting it is not sure will sometimes wave through the wrong fix instead of asking a person first.</w:t>
+      </w:r>
+    </w:p>
+    <w:p>
+      <w:pPr>
+        <w:pStyle w:val="Heading2"/>
+        <w:spacing w:after="60" w:before="150"/>
+      </w:pPr>
       <w:r>
         <w:rPr>
           <w:b/>
           <w:bCs/>
-          <w:sz w:val="19"/>
-          <w:szCs w:val="19"/>
-        </w:rPr>
-        <w:t xml:space="preserve">cost</w:t>
-      </w:r>
-      <w:r>
-        <w:rPr>
-          <w:sz w:val="19"/>
-          <w:szCs w:val="19"/>
-        </w:rPr>
-        <w:t xml:space="preserve"> (calling a large model on every single line, including the 95% that's noise, gets expensive fast and doesn't scale to a busy day); </w:t>
-      </w:r>
+          <w:color w:val="000000"/>
+          <w:sz w:val="21"/>
+          <w:szCs w:val="21"/>
+        </w:rPr>
+        <w:t xml:space="preserve">The trade off I am making</w:t>
+      </w:r>
+    </w:p>
+    <w:p>
+      <w:pPr>
+        <w:spacing w:after="90"/>
+      </w:pPr>
+      <w:r>
+        <w:rPr>
+          <w:sz w:val="18"/>
+          <w:szCs w:val="18"/>
+        </w:rPr>
+        <w:t xml:space="preserve">I am choosing to optimize for cost and accuracy over squeezing out every bit of speed. Grouping near identical log lines together before they ever reach the model, and only calling it once per distinct pattern instead of once per line, is what makes this affordable at scale. My build cuts model spend by about 97.7 percent compared to calling the model on every line, while keeping accuracy at or above target on the labeled evaluation set. The trade off is that the parts of this system that are pure rules, like filtering junk and grouping duplicates, do not need a model call, so an unusual log format the rules have not seen yet will fall through to the model instead of being caught early. That is the safer direction to fail in. I will also say plainly that my measured latency on the optimized build came in slightly above the target in the final run, which I explain in the results document, rather than leave out.</w:t>
+      </w:r>
+    </w:p>
+    <w:p>
+      <w:pPr>
+        <w:pStyle w:val="Heading2"/>
+        <w:spacing w:after="60" w:before="150"/>
+      </w:pPr>
       <w:r>
         <w:rPr>
           <w:b/>
           <w:bCs/>
-          <w:sz w:val="19"/>
-          <w:szCs w:val="19"/>
-        </w:rPr>
-        <w:t xml:space="preserve">trust</w:t>
-      </w:r>
-      <w:r>
-        <w:rPr>
-          <w:sz w:val="19"/>
-          <w:szCs w:val="19"/>
-        </w:rPr>
-        <w:t xml:space="preserve"> (a model allowed to invent its own fix text will eventually propose something nobody approved, a real incident-response risk); and </w:t>
-      </w:r>
+          <w:color w:val="000000"/>
+          <w:sz w:val="21"/>
+          <w:szCs w:val="21"/>
+        </w:rPr>
+        <w:t xml:space="preserve">The biggest risks, and how I would handle them</w:t>
+      </w:r>
+    </w:p>
+    <w:p>
+      <w:pPr>
+        <w:spacing w:after="90"/>
+      </w:pPr>
+      <w:r>
+        <w:rPr>
+          <w:sz w:val="18"/>
+          <w:szCs w:val="18"/>
+        </w:rPr>
+        <w:t xml:space="preserve">1. A wrong fix gets applied automatically. I handle this by keeping every fix choice inside a fixed, approved list that gets checked twice, once when the agent generates it and once when my own script checks it afterward. The agent cannot write its own fix as free text, and anything it is not confident about goes to a person instead of being guessed.</w:t>
+      </w:r>
+    </w:p>
+    <w:p>
+      <w:pPr>
+        <w:spacing w:after="90"/>
+      </w:pPr>
+      <w:r>
+        <w:rPr>
+          <w:sz w:val="18"/>
+          <w:szCs w:val="18"/>
+        </w:rPr>
+        <w:t xml:space="preserve">2. A real incident gets mistaken for noise. I track how often this happens and keep the noise rules on the cautious side. When something is unclear, it gets flagged, not dropped.</w:t>
+      </w:r>
+    </w:p>
+    <w:p>
+      <w:pPr>
+        <w:spacing w:after="90"/>
+      </w:pPr>
+      <w:r>
+        <w:rPr>
+          <w:sz w:val="18"/>
+          <w:szCs w:val="18"/>
+        </w:rPr>
+        <w:t xml:space="preserve">3. Log formats change over time. A rule built around today's message patterns will quietly get worse as services change their logs. I would check on this regularly so any drift shows up before it causes a miss.</w:t>
+      </w:r>
+    </w:p>
+    <w:p>
+      <w:pPr>
+        <w:pStyle w:val="Heading2"/>
+        <w:spacing w:after="60" w:before="150"/>
+      </w:pPr>
       <w:r>
         <w:rPr>
           <w:b/>
           <w:bCs/>
-          <w:sz w:val="19"/>
-          <w:szCs w:val="19"/>
-        </w:rPr>
-        <w:t xml:space="preserve">silent misses</w:t>
-      </w:r>
-      <w:r>
-        <w:rPr>
-          <w:sz w:val="19"/>
-          <w:szCs w:val="19"/>
-        </w:rPr>
-        <w:t xml:space="preserve"> (a system that guesses instead of admitting uncertainty will occasionally wave through the wrong remediation instead of asking a human).</w:t>
-      </w:r>
-    </w:p>
-    <w:p>
-      <w:pPr>
-        <w:pStyle w:val="Heading2"/>
-        <w:spacing w:after="60" w:before="160"/>
-      </w:pPr>
-      <w:r>
-        <w:rPr>
-          <w:b/>
-          <w:bCs/>
-          <w:color w:val="1F4E79"/>
-          <w:sz w:val="22"/>
-          <w:szCs w:val="22"/>
-        </w:rPr>
-        <w:t xml:space="preserve">The trade-off we're making</w:t>
-      </w:r>
-    </w:p>
-    <w:p>
-      <w:pPr>
-        <w:spacing w:after="100"/>
-      </w:pPr>
-      <w:r>
-        <w:rPr>
-          <w:sz w:val="19"/>
-          <w:szCs w:val="19"/>
-        </w:rPr>
-        <w:t xml:space="preserve">We are optimizing for </w:t>
-      </w:r>
-      <w:r>
-        <w:rPr>
-          <w:b/>
-          <w:bCs/>
-          <w:sz w:val="19"/>
-          <w:szCs w:val="19"/>
-        </w:rPr>
-        <w:t xml:space="preserve">cost and accuracy</w:t>
-      </w:r>
-      <w:r>
-        <w:rPr>
-          <w:sz w:val="19"/>
-          <w:szCs w:val="19"/>
-        </w:rPr>
-        <w:t xml:space="preserve"> over raw latency headroom. Deduplicating near-identical log lines before they reach the model, and calling it once per distinct pattern instead of once per line, is what makes this affordable at scale — our build cuts model spend by 97.7% against the naive per-line baseline while holding accuracy at or above target. The trade-off: routing decisions that are 100% mechanical (dedup, noise filtering) are pure rules, not model calls, so unusual log formats the rules haven't seen yet fall through to the model rather than being pre-filtered — the safer failure direction.</w:t>
-      </w:r>
-    </w:p>
-    <w:p>
-      <w:pPr>
-        <w:pStyle w:val="Heading2"/>
-        <w:spacing w:after="60" w:before="160"/>
-      </w:pPr>
-      <w:r>
-        <w:rPr>
-          <w:b/>
-          <w:bCs/>
-          <w:color w:val="1F4E79"/>
-          <w:sz w:val="22"/>
-          <w:szCs w:val="22"/>
-        </w:rPr>
-        <w:t xml:space="preserve">Biggest risks, and how we de-risk them</w:t>
-      </w:r>
-    </w:p>
-    <w:p>
-      <w:pPr>
-        <w:spacing w:after="100"/>
-      </w:pPr>
-      <w:r>
-        <w:rPr>
-          <w:sz w:val="19"/>
-          <w:szCs w:val="19"/>
-        </w:rPr>
-        <w:t xml:space="preserve">1. Wrong remediation applied automatically — de-risked by keeping every remediation choice inside a fixed, approved catalog validated on the way out; the agent cannot output free text as a "fix," and low-confidence calls go to a human instead of being guessed.</w:t>
-      </w:r>
-    </w:p>
-    <w:p>
-      <w:pPr>
-        <w:spacing w:after="100"/>
-      </w:pPr>
-      <w:r>
-        <w:rPr>
-          <w:sz w:val="19"/>
-          <w:szCs w:val="19"/>
-        </w:rPr>
-        <w:t xml:space="preserve">2. A real incident gets misclassified as noise — we track a false-escalation/false-drop rate explicitly and keep noise rules conservative: when in doubt, escalate, don't drop.</w:t>
-      </w:r>
-    </w:p>
-    <w:p>
-      <w:pPr>
-        <w:spacing w:after="100"/>
-      </w:pPr>
-      <w:r>
-        <w:rPr>
-          <w:sz w:val="19"/>
-          <w:szCs w:val="19"/>
-        </w:rPr>
-        <w:t xml:space="preserve">3. Log format drift — service log formats change over time, and a rule tuned to today's message templates degrades quietly; we de-risk with a scheduled review of the noise-filter hit rate so drift is visible before it causes a miss.</w:t>
-      </w:r>
-    </w:p>
-    <w:p>
-      <w:pPr>
-        <w:pStyle w:val="Heading2"/>
-        <w:spacing w:after="60" w:before="160"/>
-      </w:pPr>
-      <w:r>
-        <w:rPr>
-          <w:b/>
-          <w:bCs/>
-          <w:color w:val="1F4E79"/>
-          <w:sz w:val="22"/>
-          <w:szCs w:val="22"/>
-        </w:rPr>
-        <w:t xml:space="preserve">Scope and timeline (2-week paid engagement)</w:t>
-      </w:r>
-    </w:p>
-    <w:p>
-      <w:pPr>
-        <w:spacing w:after="100"/>
-      </w:pPr>
-      <w:r>
-        <w:rPr>
-          <w:sz w:val="19"/>
-          <w:szCs w:val="19"/>
-        </w:rPr>
-        <w:t xml:space="preserve">Week 1: ingest pipeline, dedup/clustering, noise-filter rules, closed-set classification agent, and the benchmark harness (accuracy, latency, cost against a labeled eval set) running end-to-end on the full historical log corpus.</w:t>
-      </w:r>
-    </w:p>
-    <w:p>
-      <w:pPr>
-        <w:spacing w:after="100"/>
-      </w:pPr>
-      <w:r>
-        <w:rPr>
-          <w:sz w:val="19"/>
-          <w:szCs w:val="19"/>
-        </w:rPr>
-        <w:t xml:space="preserve">Week 2: confidence gating and human-escalation workflow, retry/idempotency for pipeline failures, load-test at 10x current daily volume, and handoff docs plus a live walkthrough re-running the benchmark in front of your team.</w:t>
+          <w:color w:val="000000"/>
+          <w:sz w:val="21"/>
+          <w:szCs w:val="21"/>
+        </w:rPr>
+        <w:t xml:space="preserve">Rough scope and timeline for a two week engagement</w:t>
+      </w:r>
+    </w:p>
+    <w:p>
+      <w:pPr>
+        <w:spacing w:after="90"/>
+      </w:pPr>
+      <w:r>
+        <w:rPr>
+          <w:sz w:val="18"/>
+          <w:szCs w:val="18"/>
+        </w:rPr>
+        <w:t xml:space="preserve">Week one: build the pipeline that reads the logs, groups duplicates, filters out junk, sets up the model that classifies real incidents, and build the tool that measures accuracy, speed, and cost against real historical logs, running end to end.</w:t>
+      </w:r>
+    </w:p>
+    <w:p>
+      <w:pPr>
+        <w:spacing w:after="90"/>
+      </w:pPr>
+      <w:r>
+        <w:rPr>
+          <w:sz w:val="18"/>
+          <w:szCs w:val="18"/>
+        </w:rPr>
+        <w:t xml:space="preserve">Week two: add the part that sends unsure cases to a person, add retry handling for when something fails partway through, test it at ten times the normal daily volume, and hand off documentation plus a live walkthrough where I rerun the numbers in front of your team.</w:t>
       </w:r>
     </w:p>
     <w:sectPr>
       <w:pgSz w:w="12240" w:h="15840" w:orient="portrait"/>
-      <w:pgMar w:top="900" w:right="900" w:bottom="900" w:left="900" w:header="708" w:footer="708" w:gutter="0"/>
+      <w:pgMar w:top="850" w:right="850" w:bottom="850" w:left="850" w:header="708" w:footer="708" w:gutter="0"/>
       <w:pgNumType/>
       <w:docGrid w:linePitch="360"/>
     </w:sectPr>

</xml_diff>